<commit_message>
report: credit Arnav for the GRPO-train-against-the-simulator idea
The novel contribution - training a 9B LLM directly against the
CandyEnv reward via GRPO instead of imitation data - was Arnav's. The
contributions table is updated so:
  Arnav Mehta : proposed and led the GRPO LLM training, LoRA setup,
                prompt + reward design, Q4_K_M GGUF merge, llama-cpp
                inference agent, eval harness.
  Mohil Ahuja : board-to-text serialization, special-candy rule
                encoding, prompt template, parser, no-fallback eval
                contract.

Equal split is preserved.

Co-Authored-By: Mohil-Ahuja <mohilahuja@gmail.com>
</commit_message>
<xml_diff>
--- a/report/RL_Report.docx
+++ b/report/RL_Report.docx
@@ -1018,7 +1018,7 @@
             </w:pPr>
             <w:r/>
             <w:r>
-              <w:t>Built the llama-cpp-backed GRPO inference path (LLMGRPOGGUFAgent) and wired it into the GUI and a no-Pygame terminal mode. Wrote the fixed-board evaluation harness (eval/evaluate.py) used for the results in this report.</w:t>
+              <w:t>Proposed and led the novel idea of training a 9B language model directly against the game simulator with GRPO. Implemented the LoRA fine-tuning of Qwen 3.5-9B, the prompt and reward design for textual swap commands, the Q4_K_M GGUF merge, the llama-cpp inference agent (LLMGRPOGGUFAgent), and the fixed-board evaluation harness.</w:t>
             </w:r>
           </w:p>
         </w:tc>
@@ -1048,7 +1048,7 @@
             </w:pPr>
             <w:r/>
             <w:r>
-              <w:t>Led the GRPO LoRA training of the Qwen 3.5-9B model, designed the prompt template and reward shaping for textual swap commands, and produced the merged Q4_K_M GGUF artifact released on Hugging Face.</w:t>
+              <w:t>Built the textual board serialization, special-candy rule encoding, and prompt template that the LLM consumes. Implemented the parser and validity-check pipeline (parse-failure / model-invalid bookkeeping) and the no-fallback eval contract.</w:t>
             </w:r>
           </w:p>
         </w:tc>

</xml_diff>

<commit_message>
report: rename to "Candy Crusher" and drop the Keywords line
</commit_message>
<xml_diff>
--- a/report/RL_Report.docx
+++ b/report/RL_Report.docx
@@ -12,7 +12,7 @@
         </w:rPr>
       </w:pPr>
       <w:r>
-        <w:t>Reinforcement Learning for Stochastic Match-Three Puzzles</w:t>
+        <w:t>Candy Crusher</w:t>
       </w:r>
     </w:p>
     <w:p>
@@ -662,20 +662,6 @@
           <w:lang w:val="en-GB" w:eastAsia="en-GB"/>
         </w:rPr>
       </w:pPr>
-    </w:p>
-    <w:p>
-      <w:pPr>
-        <w:rPr>
-          <w:b/>
-          <w:i/>
-          <w:sz w:val="20"/>
-          <w:szCs w:val="20"/>
-          <w:lang w:val="en-GB" w:eastAsia="en-GB"/>
-        </w:rPr>
-      </w:pPr>
-      <w:r>
-        <w:t>Keywords—reinforcement learning, GRPO, LoRA, large language models, action masking, match-three games, PPO, DQN</w:t>
-      </w:r>
     </w:p>
     <w:p>
       <w:pPr>

</xml_diff>